<commit_message>
Programmes batch 3: Docker & Kubernetes, CKA, DevSecOps (EN + FR)
Cold-read fixes: CKA 2025 curriculum (extension interfaces, storage modes,
etcd as a production skill), lab dependencies in DevSecOps, Envoy Gateway
named for the Gateway API, French upgrade terminology.

Co-Authored-By: Claude Opus 5.5 <noreply@anthropic.com>
</commit_message>
<xml_diff>
--- a/res/programmes/DevSecOps-57h.docx
+++ b/res/programmes/DevSecOps-57h.docx
@@ -198,7 +198,7 @@
         <w:pStyle w:val="ProgBody"/>
       </w:pPr>
       <w:r>
-        <w:t>This programme adds security to a working DevOps pipeline, stage by stage, without slowing delivery down. Participants model threats, scan code and dependencies, test the running application, then secure the software supply chain: hardened and scanned images, SBOMs, signatures, attestations and SLSA provenance checked before deployment. They scan infrastructure code, enforce policies as code, manage secrets with HashiCorp Vault, and harden and watch Kubernetes at runtime. The same application and pipeline are carried through every phase, and the programme closes with a final project in which teams deliver a pipeline with a security gate at every stage and a security report.</w:t>
+        <w:t>This programme adds security to a working DevOps pipeline, stage by stage, while keeping the pipeline fast. Participants model threats, scan code and dependencies, test the running application, then secure the software supply chain: hardened and scanned images, SBOMs, signatures, attestations and SLSA provenance checked before deployment. They scan infrastructure code, enforce policies as code, manage secrets with HashiCorp Vault, and harden and watch Kubernetes at runtime. The programme closes with a final project: a pipeline with a security gate at every stage and a security report.</w:t>
       </w:r>
     </w:p>
     <w:p>
@@ -768,7 +768,7 @@
               <w:pStyle w:val="ProgTableText"/>
             </w:pPr>
             <w:r>
-              <w:t>DevOps Engineering (course), or equivalent: CI pipelines with Jenkins or GitHub Actions, Terraform, Docker and Kubernetes. Pipeline building is not taught again</w:t>
+              <w:t>CI/CD, Terraform and Kubernetes delivery (course: DevOps Engineering, which builds on Docker &amp; Kubernetes), or equivalent. Pipeline building is not taught again</w:t>
             </w:r>
           </w:p>
         </w:tc>
@@ -852,7 +852,7 @@
               <w:pStyle w:val="ProgTableText"/>
             </w:pPr>
             <w:r>
-              <w:t>Runs locally: one laptop per participant (16 GB RAM minimum, Docker, kind, VS Code), a GitHub repository per team with GitHub Actions, and a provided Jenkins and SonarQube stack in containers; Terraform code is scanned, not applied; no cloud account or cost</w:t>
+              <w:t>Runs locally: one laptop per participant (16 GB RAM minimum, Docker, kind, VS Code); Jenkins and SonarQube on a server provided by the trainer; a public GitHub repository and GitHub Container Registry per team; Terraform code is scanned, not applied; no cloud account or cost</w:t>
             </w:r>
           </w:p>
         </w:tc>
@@ -1126,7 +1126,7 @@
               <w:pStyle w:val="ProgTableText"/>
             </w:pPr>
             <w:r>
-              <w:t>SonarQube security rules, Semgrep, custom rules, triaging false positives</w:t>
+              <w:t>SonarQube security rules, Semgrep rules for injection flaws, custom rules, triaging false positives</w:t>
             </w:r>
           </w:p>
         </w:tc>
@@ -1571,7 +1571,7 @@
               <w:pStyle w:val="ProgTableText"/>
             </w:pPr>
             <w:r>
-              <w:t>Attestations, SLSA provenance, admission policies for images</w:t>
+              <w:t>Attestations, SLSA provenance, admission of signed images with the Sigstore policy-controller</w:t>
             </w:r>
           </w:p>
         </w:tc>
@@ -1815,7 +1815,7 @@
               <w:pStyle w:val="ProgTableText"/>
             </w:pPr>
             <w:r>
-              <w:t>OPA Gatekeeper and Kyverno, writing and testing policies, audit and enforce modes</w:t>
+              <w:t>Kyverno in the lab, compared with OPA Gatekeeper and the built-in ValidatingAdmissionPolicy; writing and testing policies, audit and enforce modes, image verification with Kyverno verifyImages</w:t>
             </w:r>
           </w:p>
         </w:tc>
@@ -1949,7 +1949,7 @@
               <w:pStyle w:val="ProgTableText"/>
             </w:pPr>
             <w:r>
-              <w:t>Vault integration with Jenkins and Kubernetes, secret scanning with gitleaks</w:t>
+              <w:t>Vault integration with Jenkins and Kubernetes, secret scanning with gitleaks, pinning third-party actions by commit SHA</w:t>
             </w:r>
           </w:p>
         </w:tc>

</xml_diff>